<commit_message>
feat: add exact-one-face gate and sync docs
</commit_message>
<xml_diff>
--- a/frontend/public/gen-sticker-docs/originals/01-project-charter.docx
+++ b/frontend/public/gen-sticker-docs/originals/01-project-charter.docx
@@ -162,7 +162,7 @@
           </w:tcPr>
           <w:p>
             <w:r>
-              <w:t>1.0</w:t>
+              <w:t>1.1</w:t>
             </w:r>
           </w:p>
         </w:tc>
@@ -219,7 +219,7 @@
           </w:tcPr>
           <w:p>
             <w:r>
-              <w:t>kien_v5 @ c09e26a</w:t>
+              <w:t>kien_v5 @ 4d23b9a</w:t>
             </w:r>
           </w:p>
         </w:tc>
@@ -333,7 +333,7 @@
           </w:tcPr>
           <w:p>
             <w:r>
-              <w:t>2026-08-09</w:t>
+              <w:t>2026-08-10</w:t>
             </w:r>
           </w:p>
         </w:tc>
@@ -552,6 +552,16 @@
       </w:r>
     </w:p>
     <w:p>
+      <w:pPr>
+        <w:pStyle w:val="ListBullet"/>
+        <w:spacing w:after="20"/>
+        <w:ind w:left="288"/>
+      </w:pPr>
+      <w:r>
+        <w:t>14. Baseline gate đúng một khuôn mặt</w:t>
+      </w:r>
+    </w:p>
+    <w:p>
       <w:r>
         <w:br w:type="page"/>
       </w:r>
@@ -583,6 +593,7 @@
       <w:tr>
         <w:trPr>
           <w:tblHeader w:val="true"/>
+          <w:cantSplit/>
         </w:trPr>
         <w:tc>
           <w:tcPr>
@@ -606,6 +617,7 @@
           </w:tcPr>
           <w:p>
             <w:pPr>
+              <w:keepNext/>
               <w:jc w:val="left"/>
             </w:pPr>
             <w:r>
@@ -641,6 +653,7 @@
           </w:tcPr>
           <w:p>
             <w:pPr>
+              <w:keepNext/>
               <w:jc w:val="left"/>
             </w:pPr>
             <w:r>
@@ -656,6 +669,9 @@
         </w:tc>
       </w:tr>
       <w:tr>
+        <w:trPr>
+          <w:cantSplit/>
+        </w:trPr>
         <w:tc>
           <w:tcPr>
             <w:tcW w:type="dxa" w:w="4831"/>
@@ -722,12 +738,15 @@
                 <w:color w:val="0F172A"/>
                 <w:sz w:val="18"/>
               </w:rPr>
-              <w:t>1.0</w:t>
+              <w:t>1.1</w:t>
             </w:r>
           </w:p>
         </w:tc>
       </w:tr>
       <w:tr>
+        <w:trPr>
+          <w:cantSplit/>
+        </w:trPr>
         <w:tc>
           <w:tcPr>
             <w:tcW w:type="dxa" w:w="4831"/>
@@ -800,6 +819,9 @@
         </w:tc>
       </w:tr>
       <w:tr>
+        <w:trPr>
+          <w:cantSplit/>
+        </w:trPr>
         <w:tc>
           <w:tcPr>
             <w:tcW w:type="dxa" w:w="4831"/>
@@ -866,12 +888,15 @@
                 <w:color w:val="0F172A"/>
                 <w:sz w:val="18"/>
               </w:rPr>
-              <w:t>kien_v5 / c09e26a</w:t>
+              <w:t>kien_v5 / 4d23b9a</w:t>
             </w:r>
           </w:p>
         </w:tc>
       </w:tr>
       <w:tr>
+        <w:trPr>
+          <w:cantSplit/>
+        </w:trPr>
         <w:tc>
           <w:tcPr>
             <w:tcW w:type="dxa" w:w="4831"/>
@@ -938,12 +963,15 @@
                 <w:color w:val="0F172A"/>
                 <w:sz w:val="18"/>
               </w:rPr>
-              <w:t>2026-08-09</w:t>
+              <w:t>2026-08-10</w:t>
             </w:r>
           </w:p>
         </w:tc>
       </w:tr>
       <w:tr>
+        <w:trPr>
+          <w:cantSplit/>
+        </w:trPr>
         <w:tc>
           <w:tcPr>
             <w:tcW w:type="dxa" w:w="4831"/>
@@ -1018,8 +1046,14 @@
     </w:tbl>
     <w:p>
       <w:pPr>
-        <w:spacing w:after="20"/>
+        <w:spacing w:before="0" w:after="0" w:line="20" w:lineRule="exact"/>
       </w:pPr>
+      <w:r>
+        <w:rPr>
+          <w:sz w:val="2"/>
+        </w:rPr>
+        <w:t xml:space="preserve"> </w:t>
+      </w:r>
     </w:p>
     <w:p>
       <w:pPr>
@@ -1064,8 +1098,8 @@
       <w:r>
         <w:drawing>
           <wp:inline xmlns:a="http://schemas.openxmlformats.org/drawingml/2006/main" xmlns:pic="http://schemas.openxmlformats.org/drawingml/2006/picture">
-            <wp:extent cx="6080760" cy="3420428"/>
-            <wp:docPr id="1" name="Picture 1" title="Dòng giá trị của GenSticker" descr="Sơ đồ năm bước gồm Upload, Giữ danh tính, Sinh biểu cảm, Kiểm thử và Sử dụng; ba khối dưới nêu giá trị, điểm kiểm soát và giới hạn hiện tại."/>
+            <wp:extent cx="5760720" cy="3240405"/>
+            <wp:docPr id="1" name="Picture 1" title="Dòng giá trị của GenSticker" descr="Sáu bước gồm chọn ảnh, gate một khuôn mặt, khóa nhận diện, sinh biểu cảm, kiểm tra cấu trúc và sử dụng; các callout nêu chi phí bằng không của gate, giới hạn client-only và thời điểm ảnh được gửi backend."/>
             <wp:cNvGraphicFramePr>
               <a:graphicFrameLocks noChangeAspect="1"/>
             </wp:cNvGraphicFramePr>
@@ -1085,7 +1119,7 @@
                   <pic:spPr>
                     <a:xfrm>
                       <a:off x="0" y="0"/>
-                      <a:ext cx="6080760" cy="3420428"/>
+                      <a:ext cx="5760720" cy="3240405"/>
                     </a:xfrm>
                     <a:prstGeom prst="rect"/>
                   </pic:spPr>
@@ -1103,7 +1137,7 @@
         <w:jc w:val="center"/>
       </w:pPr>
       <w:r>
-        <w:t>Hình GS-DOC-01.1 — Dòng giá trị của GenSticker. Dòng giá trị MVP từ upload chân dung đến bộ 20 sticker và các kênh sử dụng.</w:t>
+        <w:t>Hình GS-DOC-01.1 — Dòng giá trị của GenSticker. Dòng giá trị MVP có gate đúng một khuôn mặt chạy cục bộ trước khi tạo job trả phí.</w:t>
       </w:r>
     </w:p>
     <w:tbl>
@@ -1158,7 +1192,7 @@
                 <w:color w:val="475569"/>
                 <w:sz w:val="16"/>
               </w:rPr>
-              <w:t>Sơ đồ năm bước gồm Upload, Giữ danh tính, Sinh biểu cảm, Kiểm thử và Sử dụng; ba khối dưới nêu giá trị, điểm kiểm soát và giới hạn hiện tại.</w:t>
+              <w:t>Sáu bước gồm chọn ảnh, gate một khuôn mặt, khóa nhận diện, sinh biểu cảm, kiểm tra cấu trúc và sử dụng; các callout nêu chi phí bằng không của gate, giới hạn client-only và thời điểm ảnh được gửi backend.</w:t>
             </w:r>
           </w:p>
         </w:tc>
@@ -1166,7 +1200,7 @@
     </w:tbl>
     <w:p>
       <w:pPr>
-        <w:spacing w:after="160"/>
+        <w:spacing w:after="80"/>
         <w:jc w:val="center"/>
       </w:pPr>
       <w:r>
@@ -1175,7 +1209,7 @@
           <w:color w:val="475569"/>
           <w:sz w:val="14"/>
         </w:rPr>
-        <w:t>Nguồn: backend/app/services/sticker_pipeline.py; backend/sticker_generation/grouped.py; frontend/src/App.tsx · baseline kien_v5</w:t>
+        <w:t>Nguồn: frontend/src/hooks/useImageUpload.ts; frontend/src/services/faceDetectionService.ts; backend/app/services/sticker_pipeline.py · baseline kien_v5</w:t>
       </w:r>
     </w:p>
     <w:p>
@@ -1361,6 +1395,7 @@
       <w:tr>
         <w:trPr>
           <w:tblHeader w:val="true"/>
+          <w:cantSplit/>
         </w:trPr>
         <w:tc>
           <w:tcPr>
@@ -1384,6 +1419,7 @@
           </w:tcPr>
           <w:p>
             <w:pPr>
+              <w:keepNext/>
               <w:jc w:val="left"/>
             </w:pPr>
             <w:r>
@@ -1419,6 +1455,7 @@
           </w:tcPr>
           <w:p>
             <w:pPr>
+              <w:keepNext/>
               <w:jc w:val="left"/>
             </w:pPr>
             <w:r>
@@ -1434,6 +1471,9 @@
         </w:tc>
       </w:tr>
       <w:tr>
+        <w:trPr>
+          <w:cantSplit/>
+        </w:trPr>
         <w:tc>
           <w:tcPr>
             <w:tcW w:type="dxa" w:w="4831"/>
@@ -1506,6 +1546,9 @@
         </w:tc>
       </w:tr>
       <w:tr>
+        <w:trPr>
+          <w:cantSplit/>
+        </w:trPr>
         <w:tc>
           <w:tcPr>
             <w:tcW w:type="dxa" w:w="4831"/>
@@ -1578,6 +1621,9 @@
         </w:tc>
       </w:tr>
       <w:tr>
+        <w:trPr>
+          <w:cantSplit/>
+        </w:trPr>
         <w:tc>
           <w:tcPr>
             <w:tcW w:type="dxa" w:w="4831"/>
@@ -1650,6 +1696,9 @@
         </w:tc>
       </w:tr>
       <w:tr>
+        <w:trPr>
+          <w:cantSplit/>
+        </w:trPr>
         <w:tc>
           <w:tcPr>
             <w:tcW w:type="dxa" w:w="4831"/>
@@ -1722,6 +1771,9 @@
         </w:tc>
       </w:tr>
       <w:tr>
+        <w:trPr>
+          <w:cantSplit/>
+        </w:trPr>
         <w:tc>
           <w:tcPr>
             <w:tcW w:type="dxa" w:w="4831"/>
@@ -1794,6 +1846,9 @@
         </w:tc>
       </w:tr>
       <w:tr>
+        <w:trPr>
+          <w:cantSplit/>
+        </w:trPr>
         <w:tc>
           <w:tcPr>
             <w:tcW w:type="dxa" w:w="4831"/>
@@ -1868,8 +1923,14 @@
     </w:tbl>
     <w:p>
       <w:pPr>
-        <w:spacing w:after="20"/>
+        <w:spacing w:before="0" w:after="0" w:line="20" w:lineRule="exact"/>
       </w:pPr>
+      <w:r>
+        <w:rPr>
+          <w:sz w:val="2"/>
+        </w:rPr>
+        <w:t xml:space="preserve"> </w:t>
+      </w:r>
     </w:p>
     <w:p>
       <w:pPr>
@@ -2139,6 +2200,7 @@
       <w:tr>
         <w:trPr>
           <w:tblHeader w:val="true"/>
+          <w:cantSplit/>
         </w:trPr>
         <w:tc>
           <w:tcPr>
@@ -2162,6 +2224,7 @@
           </w:tcPr>
           <w:p>
             <w:pPr>
+              <w:keepNext/>
               <w:jc w:val="left"/>
             </w:pPr>
             <w:r>
@@ -2197,6 +2260,7 @@
           </w:tcPr>
           <w:p>
             <w:pPr>
+              <w:keepNext/>
               <w:jc w:val="left"/>
             </w:pPr>
             <w:r>
@@ -2232,6 +2296,7 @@
           </w:tcPr>
           <w:p>
             <w:pPr>
+              <w:keepNext/>
               <w:jc w:val="left"/>
             </w:pPr>
             <w:r>
@@ -2267,6 +2332,7 @@
           </w:tcPr>
           <w:p>
             <w:pPr>
+              <w:keepNext/>
               <w:jc w:val="left"/>
             </w:pPr>
             <w:r>
@@ -2282,6 +2348,9 @@
         </w:tc>
       </w:tr>
       <w:tr>
+        <w:trPr>
+          <w:cantSplit/>
+        </w:trPr>
         <w:tc>
           <w:tcPr>
             <w:tcW w:type="dxa" w:w="2416"/>
@@ -2424,6 +2493,9 @@
         </w:tc>
       </w:tr>
       <w:tr>
+        <w:trPr>
+          <w:cantSplit/>
+        </w:trPr>
         <w:tc>
           <w:tcPr>
             <w:tcW w:type="dxa" w:w="2416"/>
@@ -2566,6 +2638,9 @@
         </w:tc>
       </w:tr>
       <w:tr>
+        <w:trPr>
+          <w:cantSplit/>
+        </w:trPr>
         <w:tc>
           <w:tcPr>
             <w:tcW w:type="dxa" w:w="2416"/>
@@ -2708,6 +2783,9 @@
         </w:tc>
       </w:tr>
       <w:tr>
+        <w:trPr>
+          <w:cantSplit/>
+        </w:trPr>
         <w:tc>
           <w:tcPr>
             <w:tcW w:type="dxa" w:w="2416"/>
@@ -2852,8 +2930,14 @@
     </w:tbl>
     <w:p>
       <w:pPr>
-        <w:spacing w:after="20"/>
+        <w:spacing w:before="0" w:after="0" w:line="20" w:lineRule="exact"/>
       </w:pPr>
+      <w:r>
+        <w:rPr>
+          <w:sz w:val="2"/>
+        </w:rPr>
+        <w:t xml:space="preserve"> </w:t>
+      </w:r>
     </w:p>
     <w:p>
       <w:pPr>
@@ -2884,6 +2968,7 @@
       <w:tr>
         <w:trPr>
           <w:tblHeader w:val="true"/>
+          <w:cantSplit/>
         </w:trPr>
         <w:tc>
           <w:tcPr>
@@ -2907,6 +2992,7 @@
           </w:tcPr>
           <w:p>
             <w:pPr>
+              <w:keepNext/>
               <w:jc w:val="left"/>
             </w:pPr>
             <w:r>
@@ -2942,6 +3028,7 @@
           </w:tcPr>
           <w:p>
             <w:pPr>
+              <w:keepNext/>
               <w:jc w:val="left"/>
             </w:pPr>
             <w:r>
@@ -2977,6 +3064,7 @@
           </w:tcPr>
           <w:p>
             <w:pPr>
+              <w:keepNext/>
               <w:jc w:val="left"/>
             </w:pPr>
             <w:r>
@@ -3012,6 +3100,7 @@
           </w:tcPr>
           <w:p>
             <w:pPr>
+              <w:keepNext/>
               <w:jc w:val="left"/>
             </w:pPr>
             <w:r>
@@ -3027,6 +3116,9 @@
         </w:tc>
       </w:tr>
       <w:tr>
+        <w:trPr>
+          <w:cantSplit/>
+        </w:trPr>
         <w:tc>
           <w:tcPr>
             <w:tcW w:type="dxa" w:w="2416"/>
@@ -3169,6 +3261,9 @@
         </w:tc>
       </w:tr>
       <w:tr>
+        <w:trPr>
+          <w:cantSplit/>
+        </w:trPr>
         <w:tc>
           <w:tcPr>
             <w:tcW w:type="dxa" w:w="2416"/>
@@ -3311,6 +3406,9 @@
         </w:tc>
       </w:tr>
       <w:tr>
+        <w:trPr>
+          <w:cantSplit/>
+        </w:trPr>
         <w:tc>
           <w:tcPr>
             <w:tcW w:type="dxa" w:w="2416"/>
@@ -3453,6 +3551,9 @@
         </w:tc>
       </w:tr>
       <w:tr>
+        <w:trPr>
+          <w:cantSplit/>
+        </w:trPr>
         <w:tc>
           <w:tcPr>
             <w:tcW w:type="dxa" w:w="2416"/>
@@ -3519,7 +3620,7 @@
                 <w:color w:val="0F172A"/>
                 <w:sz w:val="16"/>
               </w:rPr>
-              <w:t>11 file Office + web viewer</w:t>
+              <w:t>12 file Office + web viewer</w:t>
             </w:r>
           </w:p>
         </w:tc>
@@ -3597,8 +3698,14 @@
     </w:tbl>
     <w:p>
       <w:pPr>
-        <w:spacing w:after="20"/>
+        <w:spacing w:before="0" w:after="0" w:line="20" w:lineRule="exact"/>
       </w:pPr>
+      <w:r>
+        <w:rPr>
+          <w:sz w:val="2"/>
+        </w:rPr>
+        <w:t xml:space="preserve"> </w:t>
+      </w:r>
     </w:p>
     <w:p>
       <w:pPr>
@@ -3629,6 +3736,7 @@
       <w:tr>
         <w:trPr>
           <w:tblHeader w:val="true"/>
+          <w:cantSplit/>
         </w:trPr>
         <w:tc>
           <w:tcPr>
@@ -3652,6 +3760,7 @@
           </w:tcPr>
           <w:p>
             <w:pPr>
+              <w:keepNext/>
               <w:jc w:val="left"/>
             </w:pPr>
             <w:r>
@@ -3687,6 +3796,7 @@
           </w:tcPr>
           <w:p>
             <w:pPr>
+              <w:keepNext/>
               <w:jc w:val="left"/>
             </w:pPr>
             <w:r>
@@ -3722,6 +3832,7 @@
           </w:tcPr>
           <w:p>
             <w:pPr>
+              <w:keepNext/>
               <w:jc w:val="left"/>
             </w:pPr>
             <w:r>
@@ -3757,6 +3868,7 @@
           </w:tcPr>
           <w:p>
             <w:pPr>
+              <w:keepNext/>
               <w:jc w:val="left"/>
             </w:pPr>
             <w:r>
@@ -3772,6 +3884,9 @@
         </w:tc>
       </w:tr>
       <w:tr>
+        <w:trPr>
+          <w:cantSplit/>
+        </w:trPr>
         <w:tc>
           <w:tcPr>
             <w:tcW w:type="dxa" w:w="2416"/>
@@ -3914,6 +4029,9 @@
         </w:tc>
       </w:tr>
       <w:tr>
+        <w:trPr>
+          <w:cantSplit/>
+        </w:trPr>
         <w:tc>
           <w:tcPr>
             <w:tcW w:type="dxa" w:w="2416"/>
@@ -4056,6 +4174,9 @@
         </w:tc>
       </w:tr>
       <w:tr>
+        <w:trPr>
+          <w:cantSplit/>
+        </w:trPr>
         <w:tc>
           <w:tcPr>
             <w:tcW w:type="dxa" w:w="2416"/>
@@ -4198,6 +4319,9 @@
         </w:tc>
       </w:tr>
       <w:tr>
+        <w:trPr>
+          <w:cantSplit/>
+        </w:trPr>
         <w:tc>
           <w:tcPr>
             <w:tcW w:type="dxa" w:w="2416"/>
@@ -4342,8 +4466,14 @@
     </w:tbl>
     <w:p>
       <w:pPr>
-        <w:spacing w:after="20"/>
+        <w:spacing w:before="0" w:after="0" w:line="20" w:lineRule="exact"/>
       </w:pPr>
+      <w:r>
+        <w:rPr>
+          <w:sz w:val="2"/>
+        </w:rPr>
+        <w:t xml:space="preserve"> </w:t>
+      </w:r>
     </w:p>
     <w:p>
       <w:pPr>
@@ -4407,6 +4537,774 @@
         <w:t>Mọi số liệu product KPI chưa có telemetry phải mang nhãn TBD thay vì được tự tạo.</w:t>
       </w:r>
     </w:p>
+    <w:p>
+      <w:pPr>
+        <w:pStyle w:val="Heading1"/>
+        <w:keepNext/>
+      </w:pPr>
+      <w:r>
+        <w:rPr>
+          <w:color w:val="0F172A"/>
+        </w:rPr>
+        <w:t>14. Baseline gate đúng một khuôn mặt</w:t>
+      </w:r>
+    </w:p>
+    <w:tbl>
+      <w:tblPr>
+        <w:tblStyle w:val="TableGrid"/>
+        <w:tblW w:type="auto" w:w="0"/>
+        <w:jc w:val="center"/>
+        <w:tblLayout w:type="autofit"/>
+        <w:tblLook w:firstColumn="1" w:firstRow="1" w:lastColumn="0" w:lastRow="0" w:noHBand="0" w:noVBand="1" w:val="04A0"/>
+      </w:tblPr>
+      <w:tblGrid>
+        <w:gridCol w:w="2416"/>
+        <w:gridCol w:w="2416"/>
+        <w:gridCol w:w="2416"/>
+        <w:gridCol w:w="2416"/>
+      </w:tblGrid>
+      <w:tr>
+        <w:trPr>
+          <w:tblHeader w:val="true"/>
+          <w:cantSplit/>
+        </w:trPr>
+        <w:tc>
+          <w:tcPr>
+            <w:tcW w:type="dxa" w:w="2416"/>
+            <w:shd w:fill="4338CA"/>
+            <w:tcBorders>
+              <w:top w:val="single" w:sz="6" w:color="4338CA"/>
+              <w:left w:val="single" w:sz="6" w:color="4338CA"/>
+              <w:bottom w:val="single" w:sz="6" w:color="4338CA"/>
+              <w:right w:val="single" w:sz="6" w:color="4338CA"/>
+              <w:insideH w:val="single" w:sz="6" w:color="4338CA"/>
+              <w:insideV w:val="single" w:sz="6" w:color="4338CA"/>
+            </w:tcBorders>
+            <w:tcMar>
+              <w:top w:w="80" w:type="dxa"/>
+              <w:start w:w="85" w:type="dxa"/>
+              <w:bottom w:w="80" w:type="dxa"/>
+              <w:end w:w="85" w:type="dxa"/>
+            </w:tcMar>
+            <w:vAlign w:val="center"/>
+          </w:tcPr>
+          <w:p>
+            <w:pPr>
+              <w:keepNext/>
+              <w:jc w:val="left"/>
+            </w:pPr>
+            <w:r>
+              <w:rPr>
+                <w:rFonts w:ascii="Aptos" w:hAnsi="Aptos" w:eastAsia="Arial"/>
+                <w:b/>
+                <w:color w:val="FFFFFF"/>
+                <w:sz w:val="17"/>
+              </w:rPr>
+              <w:t>Điều kiện</w:t>
+            </w:r>
+          </w:p>
+        </w:tc>
+        <w:tc>
+          <w:tcPr>
+            <w:tcW w:type="dxa" w:w="2416"/>
+            <w:shd w:fill="4338CA"/>
+            <w:tcBorders>
+              <w:top w:val="single" w:sz="6" w:color="4338CA"/>
+              <w:left w:val="single" w:sz="6" w:color="4338CA"/>
+              <w:bottom w:val="single" w:sz="6" w:color="4338CA"/>
+              <w:right w:val="single" w:sz="6" w:color="4338CA"/>
+              <w:insideH w:val="single" w:sz="6" w:color="4338CA"/>
+              <w:insideV w:val="single" w:sz="6" w:color="4338CA"/>
+            </w:tcBorders>
+            <w:tcMar>
+              <w:top w:w="80" w:type="dxa"/>
+              <w:start w:w="85" w:type="dxa"/>
+              <w:bottom w:w="80" w:type="dxa"/>
+              <w:end w:w="85" w:type="dxa"/>
+            </w:tcMar>
+            <w:vAlign w:val="center"/>
+          </w:tcPr>
+          <w:p>
+            <w:pPr>
+              <w:keepNext/>
+              <w:jc w:val="left"/>
+            </w:pPr>
+            <w:r>
+              <w:rPr>
+                <w:rFonts w:ascii="Aptos" w:hAnsi="Aptos" w:eastAsia="Arial"/>
+                <w:b/>
+                <w:color w:val="FFFFFF"/>
+                <w:sz w:val="17"/>
+              </w:rPr>
+              <w:t>Hành vi đã triển khai</w:t>
+            </w:r>
+          </w:p>
+        </w:tc>
+        <w:tc>
+          <w:tcPr>
+            <w:tcW w:type="dxa" w:w="2416"/>
+            <w:shd w:fill="4338CA"/>
+            <w:tcBorders>
+              <w:top w:val="single" w:sz="6" w:color="4338CA"/>
+              <w:left w:val="single" w:sz="6" w:color="4338CA"/>
+              <w:bottom w:val="single" w:sz="6" w:color="4338CA"/>
+              <w:right w:val="single" w:sz="6" w:color="4338CA"/>
+              <w:insideH w:val="single" w:sz="6" w:color="4338CA"/>
+              <w:insideV w:val="single" w:sz="6" w:color="4338CA"/>
+            </w:tcBorders>
+            <w:tcMar>
+              <w:top w:w="80" w:type="dxa"/>
+              <w:start w:w="85" w:type="dxa"/>
+              <w:bottom w:w="80" w:type="dxa"/>
+              <w:end w:w="85" w:type="dxa"/>
+            </w:tcMar>
+            <w:vAlign w:val="center"/>
+          </w:tcPr>
+          <w:p>
+            <w:pPr>
+              <w:keepNext/>
+              <w:jc w:val="left"/>
+            </w:pPr>
+            <w:r>
+              <w:rPr>
+                <w:rFonts w:ascii="Aptos" w:hAnsi="Aptos" w:eastAsia="Arial"/>
+                <w:b/>
+                <w:color w:val="FFFFFF"/>
+                <w:sz w:val="17"/>
+              </w:rPr>
+              <w:t>Giá trị</w:t>
+            </w:r>
+          </w:p>
+        </w:tc>
+        <w:tc>
+          <w:tcPr>
+            <w:tcW w:type="dxa" w:w="2416"/>
+            <w:shd w:fill="4338CA"/>
+            <w:tcBorders>
+              <w:top w:val="single" w:sz="6" w:color="4338CA"/>
+              <w:left w:val="single" w:sz="6" w:color="4338CA"/>
+              <w:bottom w:val="single" w:sz="6" w:color="4338CA"/>
+              <w:right w:val="single" w:sz="6" w:color="4338CA"/>
+              <w:insideH w:val="single" w:sz="6" w:color="4338CA"/>
+              <w:insideV w:val="single" w:sz="6" w:color="4338CA"/>
+            </w:tcBorders>
+            <w:tcMar>
+              <w:top w:w="80" w:type="dxa"/>
+              <w:start w:w="85" w:type="dxa"/>
+              <w:bottom w:w="80" w:type="dxa"/>
+              <w:end w:w="85" w:type="dxa"/>
+            </w:tcMar>
+            <w:vAlign w:val="center"/>
+          </w:tcPr>
+          <w:p>
+            <w:pPr>
+              <w:keepNext/>
+              <w:jc w:val="left"/>
+            </w:pPr>
+            <w:r>
+              <w:rPr>
+                <w:rFonts w:ascii="Aptos" w:hAnsi="Aptos" w:eastAsia="Arial"/>
+                <w:b/>
+                <w:color w:val="FFFFFF"/>
+                <w:sz w:val="17"/>
+              </w:rPr>
+              <w:t>Giới hạn</w:t>
+            </w:r>
+          </w:p>
+        </w:tc>
+      </w:tr>
+      <w:tr>
+        <w:trPr>
+          <w:cantSplit/>
+        </w:trPr>
+        <w:tc>
+          <w:tcPr>
+            <w:tcW w:type="dxa" w:w="2416"/>
+            <w:shd w:fill="FFFFFF"/>
+            <w:tcBorders>
+              <w:top w:val="single" w:sz="6" w:color="CBD5E1"/>
+              <w:left w:val="single" w:sz="6" w:color="CBD5E1"/>
+              <w:bottom w:val="single" w:sz="6" w:color="CBD5E1"/>
+              <w:right w:val="single" w:sz="6" w:color="CBD5E1"/>
+              <w:insideH w:val="single" w:sz="6" w:color="CBD5E1"/>
+              <w:insideV w:val="single" w:sz="6" w:color="CBD5E1"/>
+            </w:tcBorders>
+            <w:tcMar>
+              <w:top w:w="70" w:type="dxa"/>
+              <w:start w:w="80" w:type="dxa"/>
+              <w:bottom w:w="70" w:type="dxa"/>
+              <w:end w:w="80" w:type="dxa"/>
+            </w:tcMar>
+            <w:vAlign w:val="top"/>
+          </w:tcPr>
+          <w:p>
+            <w:pPr>
+              <w:spacing w:after="0"/>
+            </w:pPr>
+            <w:r>
+              <w:rPr>
+                <w:rFonts w:ascii="Aptos" w:hAnsi="Aptos" w:eastAsia="Arial"/>
+                <w:b w:val="0"/>
+                <w:color w:val="0F172A"/>
+                <w:sz w:val="16"/>
+              </w:rPr>
+              <w:t>0 khuôn mặt được phát hiện</w:t>
+            </w:r>
+          </w:p>
+        </w:tc>
+        <w:tc>
+          <w:tcPr>
+            <w:tcW w:type="dxa" w:w="2416"/>
+            <w:shd w:fill="FFFFFF"/>
+            <w:tcBorders>
+              <w:top w:val="single" w:sz="6" w:color="CBD5E1"/>
+              <w:left w:val="single" w:sz="6" w:color="CBD5E1"/>
+              <w:bottom w:val="single" w:sz="6" w:color="CBD5E1"/>
+              <w:right w:val="single" w:sz="6" w:color="CBD5E1"/>
+              <w:insideH w:val="single" w:sz="6" w:color="CBD5E1"/>
+              <w:insideV w:val="single" w:sz="6" w:color="CBD5E1"/>
+            </w:tcBorders>
+            <w:tcMar>
+              <w:top w:w="70" w:type="dxa"/>
+              <w:start w:w="80" w:type="dxa"/>
+              <w:bottom w:w="70" w:type="dxa"/>
+              <w:end w:w="80" w:type="dxa"/>
+            </w:tcMar>
+            <w:vAlign w:val="top"/>
+          </w:tcPr>
+          <w:p>
+            <w:pPr>
+              <w:spacing w:after="0"/>
+            </w:pPr>
+            <w:r>
+              <w:rPr>
+                <w:rFonts w:ascii="Aptos" w:hAnsi="Aptos" w:eastAsia="Arial"/>
+                <w:b w:val="0"/>
+                <w:color w:val="0F172A"/>
+                <w:sz w:val="16"/>
+              </w:rPr>
+              <w:t>Từ chối cục bộ, hiển thị hướng dẫn chọn ảnh chân dung</w:t>
+            </w:r>
+          </w:p>
+        </w:tc>
+        <w:tc>
+          <w:tcPr>
+            <w:tcW w:type="dxa" w:w="2416"/>
+            <w:shd w:fill="FFFFFF"/>
+            <w:tcBorders>
+              <w:top w:val="single" w:sz="6" w:color="CBD5E1"/>
+              <w:left w:val="single" w:sz="6" w:color="CBD5E1"/>
+              <w:bottom w:val="single" w:sz="6" w:color="CBD5E1"/>
+              <w:right w:val="single" w:sz="6" w:color="CBD5E1"/>
+              <w:insideH w:val="single" w:sz="6" w:color="CBD5E1"/>
+              <w:insideV w:val="single" w:sz="6" w:color="CBD5E1"/>
+            </w:tcBorders>
+            <w:tcMar>
+              <w:top w:w="70" w:type="dxa"/>
+              <w:start w:w="80" w:type="dxa"/>
+              <w:bottom w:w="70" w:type="dxa"/>
+              <w:end w:w="80" w:type="dxa"/>
+            </w:tcMar>
+            <w:vAlign w:val="top"/>
+          </w:tcPr>
+          <w:p>
+            <w:pPr>
+              <w:spacing w:after="0"/>
+            </w:pPr>
+            <w:r>
+              <w:rPr>
+                <w:rFonts w:ascii="Aptos" w:hAnsi="Aptos" w:eastAsia="Arial"/>
+                <w:b w:val="0"/>
+                <w:color w:val="0F172A"/>
+                <w:sz w:val="16"/>
+              </w:rPr>
+              <w:t>Không tạo job/không phát sinh image call</w:t>
+            </w:r>
+          </w:p>
+        </w:tc>
+        <w:tc>
+          <w:tcPr>
+            <w:tcW w:type="dxa" w:w="2416"/>
+            <w:shd w:fill="FFFFFF"/>
+            <w:tcBorders>
+              <w:top w:val="single" w:sz="6" w:color="CBD5E1"/>
+              <w:left w:val="single" w:sz="6" w:color="CBD5E1"/>
+              <w:bottom w:val="single" w:sz="6" w:color="CBD5E1"/>
+              <w:right w:val="single" w:sz="6" w:color="CBD5E1"/>
+              <w:insideH w:val="single" w:sz="6" w:color="CBD5E1"/>
+              <w:insideV w:val="single" w:sz="6" w:color="CBD5E1"/>
+            </w:tcBorders>
+            <w:tcMar>
+              <w:top w:w="70" w:type="dxa"/>
+              <w:start w:w="80" w:type="dxa"/>
+              <w:bottom w:w="70" w:type="dxa"/>
+              <w:end w:w="80" w:type="dxa"/>
+            </w:tcMar>
+            <w:vAlign w:val="top"/>
+          </w:tcPr>
+          <w:p>
+            <w:pPr>
+              <w:spacing w:after="0"/>
+            </w:pPr>
+            <w:r>
+              <w:rPr>
+                <w:rFonts w:ascii="Aptos" w:hAnsi="Aptos" w:eastAsia="Arial"/>
+                <w:b w:val="0"/>
+                <w:color w:val="0F172A"/>
+                <w:sz w:val="16"/>
+              </w:rPr>
+              <w:t>Client-only; direct API có thể bypass</w:t>
+            </w:r>
+          </w:p>
+        </w:tc>
+      </w:tr>
+      <w:tr>
+        <w:trPr>
+          <w:cantSplit/>
+        </w:trPr>
+        <w:tc>
+          <w:tcPr>
+            <w:tcW w:type="dxa" w:w="2416"/>
+            <w:shd w:fill="F8FAFC"/>
+            <w:tcBorders>
+              <w:top w:val="single" w:sz="6" w:color="CBD5E1"/>
+              <w:left w:val="single" w:sz="6" w:color="CBD5E1"/>
+              <w:bottom w:val="single" w:sz="6" w:color="CBD5E1"/>
+              <w:right w:val="single" w:sz="6" w:color="CBD5E1"/>
+              <w:insideH w:val="single" w:sz="6" w:color="CBD5E1"/>
+              <w:insideV w:val="single" w:sz="6" w:color="CBD5E1"/>
+            </w:tcBorders>
+            <w:tcMar>
+              <w:top w:w="70" w:type="dxa"/>
+              <w:start w:w="80" w:type="dxa"/>
+              <w:bottom w:w="70" w:type="dxa"/>
+              <w:end w:w="80" w:type="dxa"/>
+            </w:tcMar>
+            <w:vAlign w:val="top"/>
+          </w:tcPr>
+          <w:p>
+            <w:pPr>
+              <w:spacing w:after="0"/>
+            </w:pPr>
+            <w:r>
+              <w:rPr>
+                <w:rFonts w:ascii="Aptos" w:hAnsi="Aptos" w:eastAsia="Arial"/>
+                <w:b w:val="0"/>
+                <w:color w:val="0F172A"/>
+                <w:sz w:val="16"/>
+              </w:rPr>
+              <w:t>Đúng 1 khuôn mặt được phát hiện</w:t>
+            </w:r>
+          </w:p>
+        </w:tc>
+        <w:tc>
+          <w:tcPr>
+            <w:tcW w:type="dxa" w:w="2416"/>
+            <w:shd w:fill="F8FAFC"/>
+            <w:tcBorders>
+              <w:top w:val="single" w:sz="6" w:color="CBD5E1"/>
+              <w:left w:val="single" w:sz="6" w:color="CBD5E1"/>
+              <w:bottom w:val="single" w:sz="6" w:color="CBD5E1"/>
+              <w:right w:val="single" w:sz="6" w:color="CBD5E1"/>
+              <w:insideH w:val="single" w:sz="6" w:color="CBD5E1"/>
+              <w:insideV w:val="single" w:sz="6" w:color="CBD5E1"/>
+            </w:tcBorders>
+            <w:tcMar>
+              <w:top w:w="70" w:type="dxa"/>
+              <w:start w:w="80" w:type="dxa"/>
+              <w:bottom w:w="70" w:type="dxa"/>
+              <w:end w:w="80" w:type="dxa"/>
+            </w:tcMar>
+            <w:vAlign w:val="top"/>
+          </w:tcPr>
+          <w:p>
+            <w:pPr>
+              <w:spacing w:after="0"/>
+            </w:pPr>
+            <w:r>
+              <w:rPr>
+                <w:rFonts w:ascii="Aptos" w:hAnsi="Aptos" w:eastAsia="Arial"/>
+                <w:b w:val="0"/>
+                <w:color w:val="0F172A"/>
+                <w:sz w:val="16"/>
+              </w:rPr>
+              <w:t>Đọc preview, gắn trạng thái verified và cho phép Generate</w:t>
+            </w:r>
+          </w:p>
+        </w:tc>
+        <w:tc>
+          <w:tcPr>
+            <w:tcW w:type="dxa" w:w="2416"/>
+            <w:shd w:fill="F8FAFC"/>
+            <w:tcBorders>
+              <w:top w:val="single" w:sz="6" w:color="CBD5E1"/>
+              <w:left w:val="single" w:sz="6" w:color="CBD5E1"/>
+              <w:bottom w:val="single" w:sz="6" w:color="CBD5E1"/>
+              <w:right w:val="single" w:sz="6" w:color="CBD5E1"/>
+              <w:insideH w:val="single" w:sz="6" w:color="CBD5E1"/>
+              <w:insideV w:val="single" w:sz="6" w:color="CBD5E1"/>
+            </w:tcBorders>
+            <w:tcMar>
+              <w:top w:w="70" w:type="dxa"/>
+              <w:start w:w="80" w:type="dxa"/>
+              <w:bottom w:w="70" w:type="dxa"/>
+              <w:end w:w="80" w:type="dxa"/>
+            </w:tcMar>
+            <w:vAlign w:val="top"/>
+          </w:tcPr>
+          <w:p>
+            <w:pPr>
+              <w:spacing w:after="0"/>
+            </w:pPr>
+            <w:r>
+              <w:rPr>
+                <w:rFonts w:ascii="Aptos" w:hAnsi="Aptos" w:eastAsia="Arial"/>
+                <w:b w:val="0"/>
+                <w:color w:val="0F172A"/>
+                <w:sz w:val="16"/>
+              </w:rPr>
+              <w:t>Giảm upload nhầm trước bước trả phí</w:t>
+            </w:r>
+          </w:p>
+        </w:tc>
+        <w:tc>
+          <w:tcPr>
+            <w:tcW w:type="dxa" w:w="2416"/>
+            <w:shd w:fill="F8FAFC"/>
+            <w:tcBorders>
+              <w:top w:val="single" w:sz="6" w:color="CBD5E1"/>
+              <w:left w:val="single" w:sz="6" w:color="CBD5E1"/>
+              <w:bottom w:val="single" w:sz="6" w:color="CBD5E1"/>
+              <w:right w:val="single" w:sz="6" w:color="CBD5E1"/>
+              <w:insideH w:val="single" w:sz="6" w:color="CBD5E1"/>
+              <w:insideV w:val="single" w:sz="6" w:color="CBD5E1"/>
+            </w:tcBorders>
+            <w:tcMar>
+              <w:top w:w="70" w:type="dxa"/>
+              <w:start w:w="80" w:type="dxa"/>
+              <w:bottom w:w="70" w:type="dxa"/>
+              <w:end w:w="80" w:type="dxa"/>
+            </w:tcMar>
+            <w:vAlign w:val="top"/>
+          </w:tcPr>
+          <w:p>
+            <w:pPr>
+              <w:spacing w:after="0"/>
+            </w:pPr>
+            <w:r>
+              <w:rPr>
+                <w:rFonts w:ascii="Aptos" w:hAnsi="Aptos" w:eastAsia="Arial"/>
+                <w:b w:val="0"/>
+                <w:color w:val="0F172A"/>
+                <w:sz w:val="16"/>
+              </w:rPr>
+              <w:t>Không chứng minh identity, liveness hay likeness</w:t>
+            </w:r>
+          </w:p>
+        </w:tc>
+      </w:tr>
+      <w:tr>
+        <w:trPr>
+          <w:cantSplit/>
+        </w:trPr>
+        <w:tc>
+          <w:tcPr>
+            <w:tcW w:type="dxa" w:w="2416"/>
+            <w:shd w:fill="FFFFFF"/>
+            <w:tcBorders>
+              <w:top w:val="single" w:sz="6" w:color="CBD5E1"/>
+              <w:left w:val="single" w:sz="6" w:color="CBD5E1"/>
+              <w:bottom w:val="single" w:sz="6" w:color="CBD5E1"/>
+              <w:right w:val="single" w:sz="6" w:color="CBD5E1"/>
+              <w:insideH w:val="single" w:sz="6" w:color="CBD5E1"/>
+              <w:insideV w:val="single" w:sz="6" w:color="CBD5E1"/>
+            </w:tcBorders>
+            <w:tcMar>
+              <w:top w:w="70" w:type="dxa"/>
+              <w:start w:w="80" w:type="dxa"/>
+              <w:bottom w:w="70" w:type="dxa"/>
+              <w:end w:w="80" w:type="dxa"/>
+            </w:tcMar>
+            <w:vAlign w:val="top"/>
+          </w:tcPr>
+          <w:p>
+            <w:pPr>
+              <w:spacing w:after="0"/>
+            </w:pPr>
+            <w:r>
+              <w:rPr>
+                <w:rFonts w:ascii="Aptos" w:hAnsi="Aptos" w:eastAsia="Arial"/>
+                <w:b w:val="0"/>
+                <w:color w:val="0F172A"/>
+                <w:sz w:val="16"/>
+              </w:rPr>
+              <w:t>&gt;1 khuôn mặt được phát hiện</w:t>
+            </w:r>
+          </w:p>
+        </w:tc>
+        <w:tc>
+          <w:tcPr>
+            <w:tcW w:type="dxa" w:w="2416"/>
+            <w:shd w:fill="FFFFFF"/>
+            <w:tcBorders>
+              <w:top w:val="single" w:sz="6" w:color="CBD5E1"/>
+              <w:left w:val="single" w:sz="6" w:color="CBD5E1"/>
+              <w:bottom w:val="single" w:sz="6" w:color="CBD5E1"/>
+              <w:right w:val="single" w:sz="6" w:color="CBD5E1"/>
+              <w:insideH w:val="single" w:sz="6" w:color="CBD5E1"/>
+              <w:insideV w:val="single" w:sz="6" w:color="CBD5E1"/>
+            </w:tcBorders>
+            <w:tcMar>
+              <w:top w:w="70" w:type="dxa"/>
+              <w:start w:w="80" w:type="dxa"/>
+              <w:bottom w:w="70" w:type="dxa"/>
+              <w:end w:w="80" w:type="dxa"/>
+            </w:tcMar>
+            <w:vAlign w:val="top"/>
+          </w:tcPr>
+          <w:p>
+            <w:pPr>
+              <w:spacing w:after="0"/>
+            </w:pPr>
+            <w:r>
+              <w:rPr>
+                <w:rFonts w:ascii="Aptos" w:hAnsi="Aptos" w:eastAsia="Arial"/>
+                <w:b w:val="0"/>
+                <w:color w:val="0F172A"/>
+                <w:sz w:val="16"/>
+              </w:rPr>
+              <w:t>Từ chối cục bộ và báo số mặt</w:t>
+            </w:r>
+          </w:p>
+        </w:tc>
+        <w:tc>
+          <w:tcPr>
+            <w:tcW w:type="dxa" w:w="2416"/>
+            <w:shd w:fill="FFFFFF"/>
+            <w:tcBorders>
+              <w:top w:val="single" w:sz="6" w:color="CBD5E1"/>
+              <w:left w:val="single" w:sz="6" w:color="CBD5E1"/>
+              <w:bottom w:val="single" w:sz="6" w:color="CBD5E1"/>
+              <w:right w:val="single" w:sz="6" w:color="CBD5E1"/>
+              <w:insideH w:val="single" w:sz="6" w:color="CBD5E1"/>
+              <w:insideV w:val="single" w:sz="6" w:color="CBD5E1"/>
+            </w:tcBorders>
+            <w:tcMar>
+              <w:top w:w="70" w:type="dxa"/>
+              <w:start w:w="80" w:type="dxa"/>
+              <w:bottom w:w="70" w:type="dxa"/>
+              <w:end w:w="80" w:type="dxa"/>
+            </w:tcMar>
+            <w:vAlign w:val="top"/>
+          </w:tcPr>
+          <w:p>
+            <w:pPr>
+              <w:spacing w:after="0"/>
+            </w:pPr>
+            <w:r>
+              <w:rPr>
+                <w:rFonts w:ascii="Aptos" w:hAnsi="Aptos" w:eastAsia="Arial"/>
+                <w:b w:val="0"/>
+                <w:color w:val="0F172A"/>
+                <w:sz w:val="16"/>
+              </w:rPr>
+              <w:t>Giữ contract một chủ thể đầu vào</w:t>
+            </w:r>
+          </w:p>
+        </w:tc>
+        <w:tc>
+          <w:tcPr>
+            <w:tcW w:type="dxa" w:w="2416"/>
+            <w:shd w:fill="FFFFFF"/>
+            <w:tcBorders>
+              <w:top w:val="single" w:sz="6" w:color="CBD5E1"/>
+              <w:left w:val="single" w:sz="6" w:color="CBD5E1"/>
+              <w:bottom w:val="single" w:sz="6" w:color="CBD5E1"/>
+              <w:right w:val="single" w:sz="6" w:color="CBD5E1"/>
+              <w:insideH w:val="single" w:sz="6" w:color="CBD5E1"/>
+              <w:insideV w:val="single" w:sz="6" w:color="CBD5E1"/>
+            </w:tcBorders>
+            <w:tcMar>
+              <w:top w:w="70" w:type="dxa"/>
+              <w:start w:w="80" w:type="dxa"/>
+              <w:bottom w:w="70" w:type="dxa"/>
+              <w:end w:w="80" w:type="dxa"/>
+            </w:tcMar>
+            <w:vAlign w:val="top"/>
+          </w:tcPr>
+          <w:p>
+            <w:pPr>
+              <w:spacing w:after="0"/>
+            </w:pPr>
+            <w:r>
+              <w:rPr>
+                <w:rFonts w:ascii="Aptos" w:hAnsi="Aptos" w:eastAsia="Arial"/>
+                <w:b w:val="0"/>
+                <w:color w:val="0F172A"/>
+                <w:sz w:val="16"/>
+              </w:rPr>
+              <w:t>Mặt nhỏ/che khuất có thể không được đếm</w:t>
+            </w:r>
+          </w:p>
+        </w:tc>
+      </w:tr>
+      <w:tr>
+        <w:trPr>
+          <w:cantSplit/>
+        </w:trPr>
+        <w:tc>
+          <w:tcPr>
+            <w:tcW w:type="dxa" w:w="2416"/>
+            <w:shd w:fill="F8FAFC"/>
+            <w:tcBorders>
+              <w:top w:val="single" w:sz="6" w:color="CBD5E1"/>
+              <w:left w:val="single" w:sz="6" w:color="CBD5E1"/>
+              <w:bottom w:val="single" w:sz="6" w:color="CBD5E1"/>
+              <w:right w:val="single" w:sz="6" w:color="CBD5E1"/>
+              <w:insideH w:val="single" w:sz="6" w:color="CBD5E1"/>
+              <w:insideV w:val="single" w:sz="6" w:color="CBD5E1"/>
+            </w:tcBorders>
+            <w:tcMar>
+              <w:top w:w="70" w:type="dxa"/>
+              <w:start w:w="80" w:type="dxa"/>
+              <w:bottom w:w="70" w:type="dxa"/>
+              <w:end w:w="80" w:type="dxa"/>
+            </w:tcMar>
+            <w:vAlign w:val="top"/>
+          </w:tcPr>
+          <w:p>
+            <w:pPr>
+              <w:spacing w:after="0"/>
+            </w:pPr>
+            <w:r>
+              <w:rPr>
+                <w:rFonts w:ascii="Aptos" w:hAnsi="Aptos" w:eastAsia="Arial"/>
+                <w:b w:val="0"/>
+                <w:color w:val="0F172A"/>
+                <w:sz w:val="16"/>
+              </w:rPr>
+              <w:t>Worker/model/timeout lỗi</w:t>
+            </w:r>
+          </w:p>
+        </w:tc>
+        <w:tc>
+          <w:tcPr>
+            <w:tcW w:type="dxa" w:w="2416"/>
+            <w:shd w:fill="F8FAFC"/>
+            <w:tcBorders>
+              <w:top w:val="single" w:sz="6" w:color="CBD5E1"/>
+              <w:left w:val="single" w:sz="6" w:color="CBD5E1"/>
+              <w:bottom w:val="single" w:sz="6" w:color="CBD5E1"/>
+              <w:right w:val="single" w:sz="6" w:color="CBD5E1"/>
+              <w:insideH w:val="single" w:sz="6" w:color="CBD5E1"/>
+              <w:insideV w:val="single" w:sz="6" w:color="CBD5E1"/>
+            </w:tcBorders>
+            <w:tcMar>
+              <w:top w:w="70" w:type="dxa"/>
+              <w:start w:w="80" w:type="dxa"/>
+              <w:bottom w:w="70" w:type="dxa"/>
+              <w:end w:w="80" w:type="dxa"/>
+            </w:tcMar>
+            <w:vAlign w:val="top"/>
+          </w:tcPr>
+          <w:p>
+            <w:pPr>
+              <w:spacing w:after="0"/>
+            </w:pPr>
+            <w:r>
+              <w:rPr>
+                <w:rFonts w:ascii="Aptos" w:hAnsi="Aptos" w:eastAsia="Arial"/>
+                <w:b w:val="0"/>
+                <w:color w:val="0F172A"/>
+                <w:sz w:val="16"/>
+              </w:rPr>
+              <w:t>Fail closed; yêu cầu tải lại và thử lại</w:t>
+            </w:r>
+          </w:p>
+        </w:tc>
+        <w:tc>
+          <w:tcPr>
+            <w:tcW w:type="dxa" w:w="2416"/>
+            <w:shd w:fill="F8FAFC"/>
+            <w:tcBorders>
+              <w:top w:val="single" w:sz="6" w:color="CBD5E1"/>
+              <w:left w:val="single" w:sz="6" w:color="CBD5E1"/>
+              <w:bottom w:val="single" w:sz="6" w:color="CBD5E1"/>
+              <w:right w:val="single" w:sz="6" w:color="CBD5E1"/>
+              <w:insideH w:val="single" w:sz="6" w:color="CBD5E1"/>
+              <w:insideV w:val="single" w:sz="6" w:color="CBD5E1"/>
+            </w:tcBorders>
+            <w:tcMar>
+              <w:top w:w="70" w:type="dxa"/>
+              <w:start w:w="80" w:type="dxa"/>
+              <w:bottom w:w="70" w:type="dxa"/>
+              <w:end w:w="80" w:type="dxa"/>
+            </w:tcMar>
+            <w:vAlign w:val="top"/>
+          </w:tcPr>
+          <w:p>
+            <w:pPr>
+              <w:spacing w:after="0"/>
+            </w:pPr>
+            <w:r>
+              <w:rPr>
+                <w:rFonts w:ascii="Aptos" w:hAnsi="Aptos" w:eastAsia="Arial"/>
+                <w:b w:val="0"/>
+                <w:color w:val="0F172A"/>
+                <w:sz w:val="16"/>
+              </w:rPr>
+              <w:t>Không silently bypass gate</w:t>
+            </w:r>
+          </w:p>
+        </w:tc>
+        <w:tc>
+          <w:tcPr>
+            <w:tcW w:type="dxa" w:w="2416"/>
+            <w:shd w:fill="F8FAFC"/>
+            <w:tcBorders>
+              <w:top w:val="single" w:sz="6" w:color="CBD5E1"/>
+              <w:left w:val="single" w:sz="6" w:color="CBD5E1"/>
+              <w:bottom w:val="single" w:sz="6" w:color="CBD5E1"/>
+              <w:right w:val="single" w:sz="6" w:color="CBD5E1"/>
+              <w:insideH w:val="single" w:sz="6" w:color="CBD5E1"/>
+              <w:insideV w:val="single" w:sz="6" w:color="CBD5E1"/>
+            </w:tcBorders>
+            <w:tcMar>
+              <w:top w:w="70" w:type="dxa"/>
+              <w:start w:w="80" w:type="dxa"/>
+              <w:bottom w:w="70" w:type="dxa"/>
+              <w:end w:w="80" w:type="dxa"/>
+            </w:tcMar>
+            <w:vAlign w:val="top"/>
+          </w:tcPr>
+          <w:p>
+            <w:pPr>
+              <w:spacing w:after="0"/>
+            </w:pPr>
+            <w:r>
+              <w:rPr>
+                <w:rFonts w:ascii="Aptos" w:hAnsi="Aptos" w:eastAsia="Arial"/>
+                <w:b w:val="0"/>
+                <w:color w:val="0F172A"/>
+                <w:sz w:val="16"/>
+              </w:rPr>
+              <w:t>Phụ thuộc Web Worker, createImageBitmap, WASM CDN</w:t>
+            </w:r>
+          </w:p>
+        </w:tc>
+      </w:tr>
+    </w:tbl>
+    <w:p>
+      <w:pPr>
+        <w:spacing w:before="0" w:after="0" w:line="20" w:lineRule="exact"/>
+      </w:pPr>
+      <w:r>
+        <w:rPr>
+          <w:sz w:val="2"/>
+        </w:rPr>
+        <w:t xml:space="preserve"> </w:t>
+      </w:r>
+    </w:p>
     <w:sectPr>
       <w:headerReference w:type="default" r:id="rId9"/>
       <w:footerReference w:type="default" r:id="rId10"/>
@@ -4453,7 +5351,7 @@
               <w:color w:val="475569"/>
               <w:sz w:val="16"/>
             </w:rPr>
-            <w:t>kien_v5 @ c09e26a  •  2026-08-09</w:t>
+            <w:t>kien_v5 @ 4d23b9a + working tree</w:t>
           </w:r>
         </w:p>
       </w:tc>

</xml_diff>